<commit_message>
Serve the demo at surette-demo.duckdns.org; redirect older addresses; deploy reads the site name from the server
</commit_message>
<xml_diff>
--- a/docs/exports/operations-guide.docx
+++ b/docs/exports/operations-guide.docx
@@ -459,7 +459,8 @@
     <w:tbl>
       <w:tblPr>
         <w:tblStyle w:val="Table"/>
-        <w:tblW w:type="auto" w:w="0"/>
+        <w:tblW w:type="pct" w:w="5000"/>
+        <w:tblLayout w:type="fixed"/>
         <w:tblLook w:firstRow="1" w:lastRow="0" w:firstColumn="0" w:lastColumn="0" w:noHBand="0" w:noVBand="0" w:val="0020"/>
       </w:tblPr>
       <w:tblGrid>
@@ -512,7 +513,7 @@
               <w:pStyle w:val="Compact"/>
             </w:pPr>
             <w:r>
-              <w:t xml:space="preserve">https://129-213-166-31.sslip.io</w:t>
+              <w:t xml:space="preserve">https://surette-demo.duckdns.org (the old https://129-213-166-31.sslip.io redirects here)</w:t>
             </w:r>
           </w:p>
         </w:tc>
@@ -3021,7 +3022,31 @@
               <w:pStyle w:val="Compact"/>
             </w:pPr>
             <w:r>
-              <w:t xml:space="preserve">https://129-213-166-31.sslip.io (free name from sslip.io; HTTPS by Caddy + Let’s Encrypt)</w:t>
+              <w:t xml:space="preserve">https://surette-demo.duckdns.org (free DuckDNS name; HTTPS by Caddy + Let’s Encrypt). The sslip.io name redirects to it (</w:t>
+            </w:r>
+            <w:r>
+              <w:rPr>
+                <w:rStyle w:val="VerbatimChar"/>
+              </w:rPr>
+              <w:t xml:space="preserve">REDIRECT_HOSTS</w:t>
+            </w:r>
+            <w:r>
+              <w:t xml:space="preserve"> </w:t>
+            </w:r>
+            <w:r>
+              <w:t xml:space="preserve">in the server’s</w:t>
+            </w:r>
+            <w:r>
+              <w:t xml:space="preserve"> </w:t>
+            </w:r>
+            <w:r>
+              <w:rPr>
+                <w:rStyle w:val="VerbatimChar"/>
+              </w:rPr>
+              <w:t xml:space="preserve">.env</w:t>
+            </w:r>
+            <w:r>
+              <w:t xml:space="preserve">)</w:t>
             </w:r>
           </w:p>
         </w:tc>
@@ -4779,9 +4804,9 @@
       <w:pPr>
         <w:pStyle w:val="Heading3"/>
       </w:pPr>
-      <w:bookmarkStart w:id="24" w:name="_c5d7727fc83a5121a5ee427badc4fda7aa1d987"/>
-      <w:r>
-        <w:t xml:space="preserve">7.5 A custom name: surette-demo.duckdns.org (free)</w:t>
+      <w:bookmarkStart w:id="24" w:name="_4036b22d77726f826e30f77d76426feab8282c7"/>
+      <w:r>
+        <w:t xml:space="preserve">7.5 A custom name: surette-demo.duckdns.org (free, set up)</w:t>
       </w:r>
       <w:bookmarkEnd w:id="24"/>
     </w:p>
@@ -4885,7 +4910,13 @@
         </w:numPr>
       </w:pPr>
       <w:r>
-        <w:t xml:space="preserve">Switch the site to the new name (Caddy gets a new HTTPS certificate automatically):</w:t>
+        <w:t xml:space="preserve">Switch the site to the new name (Caddy gets a new HTTPS certificate automatically), keep the old name</w:t>
+      </w:r>
+      <w:r>
+        <w:t xml:space="preserve"> </w:t>
+      </w:r>
+      <w:r>
+        <w:t xml:space="preserve">as a redirect, and let the analytics collector accept the new address:</w:t>
       </w:r>
     </w:p>
     <w:p>
@@ -4924,7 +4955,88 @@
         <w:rPr>
           <w:rStyle w:val="StringTok"/>
         </w:rPr>
-        <w:t xml:space="preserve">"cd surette &amp;&amp; sed -i 's/^SITE_HOST=.*/SITE_HOST=surette-demo.duckdns.org/' .env &amp;&amp; docker compose up -d"</w:t>
+        <w:t xml:space="preserve">"cd surette &amp;&amp; sed -i 's/^SITE_HOST=.*/SITE_HOST=surette-demo.duckdns.org/' .env &amp;&amp; echo REDIRECT_HOSTS=129-213-166-31.sslip.io &gt;&gt; .env &amp;&amp; docker compose up -d"</w:t>
+      </w:r>
+      <w:r>
+        <w:br/>
+      </w:r>
+      <w:r>
+        <w:rPr>
+          <w:rStyle w:val="FunctionTok"/>
+        </w:rPr>
+        <w:t xml:space="preserve">ssh</w:t>
+      </w:r>
+      <w:r>
+        <w:rPr>
+          <w:rStyle w:val="NormalTok"/>
+        </w:rPr>
+        <w:t xml:space="preserve"> </w:t>
+      </w:r>
+      <w:r>
+        <w:rPr>
+          <w:rStyle w:val="AttributeTok"/>
+        </w:rPr>
+        <w:t xml:space="preserve">-i</w:t>
+      </w:r>
+      <w:r>
+        <w:rPr>
+          <w:rStyle w:val="NormalTok"/>
+        </w:rPr>
+        <w:t xml:space="preserve"> ~/.ssh/surette_oracle ubuntu@129.213.166.31 </w:t>
+      </w:r>
+      <w:r>
+        <w:rPr>
+          <w:rStyle w:val="StringTok"/>
+        </w:rPr>
+        <w:t xml:space="preserve">"cd surette &amp;&amp; docker compose exec -T db psql -U surette -d surette -c </w:t>
+      </w:r>
+      <w:r>
+        <w:rPr>
+          <w:rStyle w:val="DataTypeTok"/>
+        </w:rPr>
+        <w:t xml:space="preserve">\"</w:t>
+      </w:r>
+      <w:r>
+        <w:rPr>
+          <w:rStyle w:val="StringTok"/>
+        </w:rPr>
+        <w:t xml:space="preserve">UPDATE analytics_projects SET allowed_origins = array_append(allowed_origins, 'https://surette-demo.duckdns.org')</w:t>
+      </w:r>
+      <w:r>
+        <w:rPr>
+          <w:rStyle w:val="DataTypeTok"/>
+        </w:rPr>
+        <w:t xml:space="preserve">\"</w:t>
+      </w:r>
+      <w:r>
+        <w:rPr>
+          <w:rStyle w:val="StringTok"/>
+        </w:rPr>
+        <w:t xml:space="preserve">"</w:t>
+      </w:r>
+    </w:p>
+    <w:p>
+      <w:pPr>
+        <w:pStyle w:val="FirstParagraph"/>
+        <w:numPr>
+          <w:ilvl w:val="0"/>
+          <w:numId w:val="1000"/>
+        </w:numPr>
+      </w:pPr>
+      <w:r>
+        <w:t xml:space="preserve">This is already done for</w:t>
+      </w:r>
+      <w:r>
+        <w:t xml:space="preserve"> </w:t>
+      </w:r>
+      <w:r>
+        <w:rPr>
+          <w:rStyle w:val="VerbatimChar"/>
+        </w:rPr>
+        <w:t xml:space="preserve">surette-demo.duckdns.org</w:t>
+      </w:r>
+      <w:r>
+        <w:t xml:space="preserve">.</w:t>
       </w:r>
     </w:p>
     <w:p>

</xml_diff>